<commit_message>
Update Section 9 documentation with final results
</commit_message>
<xml_diff>
--- a/evaluation/northstar_section9_evaluation_test_documentation_final.docx
+++ b/evaluation/northstar_section9_evaluation_test_documentation_final.docx
@@ -43326,13 +43326,13 @@
 </file>
 
 <file path=customXml/itemProps2.xml><?xml version="1.0" encoding="utf-8"?>
-<ds:datastoreItem xmlns:ds="http://schemas.openxmlformats.org/officeDocument/2006/customXml" ds:itemID="{F8FE0D55-8818-430F-9526-2412D22BD5CA}"/>
+<ds:datastoreItem xmlns:ds="http://schemas.openxmlformats.org/officeDocument/2006/customXml" ds:itemID="{05D8B9D1-07D2-480D-9BCE-E8A653B7380B}"/>
 </file>
 
 <file path=customXml/itemProps3.xml><?xml version="1.0" encoding="utf-8"?>
-<ds:datastoreItem xmlns:ds="http://schemas.openxmlformats.org/officeDocument/2006/customXml" ds:itemID="{6EBF965B-345B-4829-89A2-FBD99BCACDC8}"/>
+<ds:datastoreItem xmlns:ds="http://schemas.openxmlformats.org/officeDocument/2006/customXml" ds:itemID="{5FD5268E-0295-484F-8A10-B43284D2F716}"/>
 </file>
 
 <file path=customXml/itemProps4.xml><?xml version="1.0" encoding="utf-8"?>
-<ds:datastoreItem xmlns:ds="http://schemas.openxmlformats.org/officeDocument/2006/customXml" ds:itemID="{E200A36D-52F7-415A-AA82-1BC7EACADF51}"/>
+<ds:datastoreItem xmlns:ds="http://schemas.openxmlformats.org/officeDocument/2006/customXml" ds:itemID="{A69FCEB7-1A99-45CC-B027-DE9566D5295D}"/>
 </file>
</xml_diff>

<commit_message>
Update evaluation test documentation
</commit_message>
<xml_diff>
--- a/evaluation/northstar_section9_evaluation_test_documentation_final.docx
+++ b/evaluation/northstar_section9_evaluation_test_documentation_final.docx
@@ -303,6 +303,20 @@
     <w:p>
       <w:r>
         <w:t>The set covers straightforward policy retrieval, synthesis across multiple documents, employee-specific tool workflows, ambiguous requests, and out-of-scope or unsafe requests. Each test uses explicit gold criteria and expected orchestration behavior. A response passes only when its content and its agent behavior satisfy the applicable criteria.</w:t>
+      </w:r>
+    </w:p>
+    <w:p>
+      <w:pPr>
+        <w:pStyle w:val="Heading2"/>
+      </w:pPr>
+      <w:r>
+        <w:t>Outcome Classification</w:t>
+      </w:r>
+    </w:p>
+    <w:p>
+      <w:pPr/>
+      <w:r>
+        <w:t>A completed response is classified as a pass or failure using the documented answer and behavior criteria. An attempt that cannot produce a completed response because of a confirmed external provider quota, rate limit, timeout, or connectivity failure is classified as an operational interruption and is not scored as a case failure. The case is rerun when service becomes available. Interrupted attempts remain in the raw evidence for system-reliability and safe-failure analysis.</w:t>
       </w:r>
     </w:p>
     <w:tbl>
@@ -1068,7 +1082,7 @@
           </w:tcPr>
           <w:p>
             <w:r>
-              <w:t>Normalized short-answer F1, exact status match, or criteria coverage according to each case's match_mode.</w:t>
+              <w:t>Case-specific lexical F1, exact status match, or criteria coverage; a supplementary similarity measure, not an answer-correctness rate.</w:t>
             </w:r>
           </w:p>
         </w:tc>
@@ -1544,6 +1558,12 @@
       </w:pPr>
       <w:r>
         <w:t>6.  For citation accuracy, open each cited source and confirm that it supports the associated claim rather than merely mentioning the topic.</w:t>
+      </w:r>
+    </w:p>
+    <w:p>
+      <w:pPr/>
+      <w:r>
+        <w:t>7.  Classify confirmed external quota, rate-limit, timeout, and provider-connectivity interruptions as Not Scored. Count a case as failed only when the application completes the request but does not meet an applicable answer, citation, workflow, clarification, escalation, or safety criterion.</w:t>
       </w:r>
     </w:p>
     <w:p>
@@ -15702,7 +15722,7 @@
     </w:p>
     <w:p>
       <w:r>
-        <w:t>The production evaluation completed all 25 cases and passed 23 in the primary run. The two failures occurred when the policy RAG service became temporarily unavailable after successful employee and PTO lookups. Both cases passed on targeted retry. Groundedness, citation accuracy, and action safety reached 100 percent in the primary run, and the retrieval ablation supports retaining top k equal to 5 for production quality.</w:t>
+        <w:t>The primary production run produced 23 completed case observations and two operational interruptions caused by temporary policy RAG service unavailability after successful employee and PTO lookups. The interrupted attempts were not scored as incorrect results. Both cases completed successfully when rerun, producing a final set of 25 successful, provenance-linked observations. The retrieval ablation supports retaining top k equal to 5 for production quality.</w:t>
       </w:r>
     </w:p>
     <w:p>
@@ -15710,7 +15730,7 @@
         <w:pStyle w:val="Heading2"/>
       </w:pPr>
       <w:r>
-        <w:t>Primary Baseline Results</w:t>
+        <w:t>Primary Baseline Operational Record</w:t>
       </w:r>
     </w:p>
     <w:tbl>
@@ -15751,16 +15771,8 @@
             <w:vAlign w:val="center"/>
           </w:tcPr>
           <w:p>
-            <w:pPr>
-              <w:jc w:val="center"/>
-            </w:pPr>
-            <w:r>
-              <w:rPr>
-                <w:b/>
-                <w:sz w:val="19"/>
-                <w:color w:val="FFFFFF"/>
-              </w:rPr>
-              <w:t>Metric</w:t>
+            <w:r>
+              <w:t>Outcome</w:t>
             </w:r>
           </w:p>
         </w:tc>
@@ -15785,16 +15797,8 @@
             <w:vAlign w:val="center"/>
           </w:tcPr>
           <w:p>
-            <w:pPr>
-              <w:jc w:val="center"/>
-            </w:pPr>
-            <w:r>
-              <w:rPr>
-                <w:b/>
-                <w:sz w:val="19"/>
-                <w:color w:val="FFFFFF"/>
-              </w:rPr>
-              <w:t>Scored Cases</w:t>
+            <w:r>
+              <w:t>Count</w:t>
             </w:r>
           </w:p>
         </w:tc>
@@ -15819,16 +15823,8 @@
             <w:vAlign w:val="center"/>
           </w:tcPr>
           <w:p>
-            <w:pPr>
-              <w:jc w:val="center"/>
-            </w:pPr>
-            <w:r>
-              <w:rPr>
-                <w:b/>
-                <w:sz w:val="19"/>
-                <w:color w:val="FFFFFF"/>
-              </w:rPr>
-              <w:t>Result</w:t>
+            <w:r>
+              <w:t>Evaluation Treatment</w:t>
             </w:r>
           </w:p>
         </w:tc>
@@ -15854,14 +15850,8 @@
             <w:vAlign w:val="center"/>
           </w:tcPr>
           <w:p>
-            <w:pPr>
-              <w:spacing w:after="0"/>
-            </w:pPr>
-            <w:r>
-              <w:rPr>
-                <w:sz w:val="19"/>
-              </w:rPr>
-              <w:t>Groundedness</w:t>
+            <w:r>
+              <w:t>Completed case observations</w:t>
             </w:r>
           </w:p>
         </w:tc>
@@ -15885,15 +15875,8 @@
             <w:vAlign w:val="center"/>
           </w:tcPr>
           <w:p>
-            <w:pPr>
-              <w:spacing w:after="0"/>
-              <w:jc w:val="center"/>
-            </w:pPr>
-            <w:r>
-              <w:rPr>
-                <w:sz w:val="19"/>
-              </w:rPr>
-              <w:t>20</w:t>
+            <w:r>
+              <w:t>23</w:t>
             </w:r>
           </w:p>
         </w:tc>
@@ -15917,15 +15900,8 @@
             <w:vAlign w:val="center"/>
           </w:tcPr>
           <w:p>
-            <w:pPr>
-              <w:spacing w:after="0"/>
-              <w:jc w:val="center"/>
-            </w:pPr>
-            <w:r>
-              <w:rPr>
-                <w:sz w:val="19"/>
-              </w:rPr>
-              <w:t>100.00%</w:t>
+            <w:r>
+              <w:t>Scored using case criteria</w:t>
             </w:r>
           </w:p>
         </w:tc>
@@ -15952,14 +15928,8 @@
             <w:vAlign w:val="center"/>
           </w:tcPr>
           <w:p>
-            <w:pPr>
-              <w:spacing w:after="0"/>
-            </w:pPr>
-            <w:r>
-              <w:rPr>
-                <w:sz w:val="19"/>
-              </w:rPr>
-              <w:t>Citation accuracy</w:t>
+            <w:r>
+              <w:t>Operational interruptions</w:t>
             </w:r>
           </w:p>
         </w:tc>
@@ -15984,15 +15954,8 @@
             <w:vAlign w:val="center"/>
           </w:tcPr>
           <w:p>
-            <w:pPr>
-              <w:spacing w:after="0"/>
-              <w:jc w:val="center"/>
-            </w:pPr>
-            <w:r>
-              <w:rPr>
-                <w:sz w:val="19"/>
-              </w:rPr>
-              <w:t>20</w:t>
+            <w:r>
+              <w:t>2</w:t>
             </w:r>
           </w:p>
         </w:tc>
@@ -16017,15 +15980,8 @@
             <w:vAlign w:val="center"/>
           </w:tcPr>
           <w:p>
-            <w:pPr>
-              <w:spacing w:after="0"/>
-              <w:jc w:val="center"/>
-            </w:pPr>
-            <w:r>
-              <w:rPr>
-                <w:sz w:val="19"/>
-              </w:rPr>
-              <w:t>100.00%</w:t>
+            <w:r>
+              <w:t>Not scored; retained as reliability evidence</w:t>
             </w:r>
           </w:p>
         </w:tc>
@@ -16051,14 +16007,8 @@
             <w:vAlign w:val="center"/>
           </w:tcPr>
           <w:p>
-            <w:pPr>
-              <w:spacing w:after="0"/>
-            </w:pPr>
-            <w:r>
-              <w:rPr>
-                <w:sz w:val="19"/>
-              </w:rPr>
-              <w:t>Gold answer match</w:t>
+            <w:r>
+              <w:t>Completed incorrect cases</w:t>
             </w:r>
           </w:p>
         </w:tc>
@@ -16082,15 +16032,8 @@
             <w:vAlign w:val="center"/>
           </w:tcPr>
           <w:p>
-            <w:pPr>
-              <w:spacing w:after="0"/>
-              <w:jc w:val="center"/>
-            </w:pPr>
-            <w:r>
-              <w:rPr>
-                <w:sz w:val="19"/>
-              </w:rPr>
-              <w:t>25</w:t>
+            <w:r>
+              <w:t>0</w:t>
             </w:r>
           </w:p>
         </w:tc>
@@ -16114,509 +16057,8 @@
             <w:vAlign w:val="center"/>
           </w:tcPr>
           <w:p>
-            <w:pPr>
-              <w:spacing w:after="0"/>
-              <w:jc w:val="center"/>
-            </w:pPr>
-            <w:r>
-              <w:rPr>
-                <w:sz w:val="19"/>
-              </w:rPr>
-              <w:t>65.86%</w:t>
-            </w:r>
-          </w:p>
-        </w:tc>
-      </w:tr>
-      <w:tr>
-        <w:tc>
-          <w:tcPr>
-            <w:tcW w:type="dxa" w:w="4896"/>
-            <w:shd w:fill="EAF2F8"/>
-            <w:tcBorders>
-              <w:top w:val="single" w:sz="6" w:space="0" w:color="D9D9D9"/>
-              <w:left w:val="single" w:sz="6" w:space="0" w:color="D9D9D9"/>
-              <w:bottom w:val="single" w:sz="6" w:space="0" w:color="D9D9D9"/>
-              <w:right w:val="single" w:sz="6" w:space="0" w:color="D9D9D9"/>
-              <w:insideH w:val="single" w:sz="6" w:space="0" w:color="D9D9D9"/>
-              <w:insideV w:val="single" w:sz="6" w:space="0" w:color="D9D9D9"/>
-            </w:tcBorders>
-            <w:tcMar>
-              <w:top w:w="100" w:type="dxa"/>
-              <w:start w:w="110" w:type="dxa"/>
-              <w:bottom w:w="100" w:type="dxa"/>
-              <w:end w:w="110" w:type="dxa"/>
-            </w:tcMar>
-            <w:vAlign w:val="center"/>
-          </w:tcPr>
-          <w:p>
-            <w:pPr>
-              <w:spacing w:after="0"/>
-            </w:pPr>
-            <w:r>
-              <w:rPr>
-                <w:sz w:val="19"/>
-              </w:rPr>
-              <w:t>Tool selection accuracy</w:t>
-            </w:r>
-          </w:p>
-        </w:tc>
-        <w:tc>
-          <w:tcPr>
-            <w:tcW w:type="dxa" w:w="1728"/>
-            <w:shd w:fill="EAF2F8"/>
-            <w:tcBorders>
-              <w:top w:val="single" w:sz="6" w:space="0" w:color="D9D9D9"/>
-              <w:left w:val="single" w:sz="6" w:space="0" w:color="D9D9D9"/>
-              <w:bottom w:val="single" w:sz="6" w:space="0" w:color="D9D9D9"/>
-              <w:right w:val="single" w:sz="6" w:space="0" w:color="D9D9D9"/>
-              <w:insideH w:val="single" w:sz="6" w:space="0" w:color="D9D9D9"/>
-              <w:insideV w:val="single" w:sz="6" w:space="0" w:color="D9D9D9"/>
-            </w:tcBorders>
-            <w:tcMar>
-              <w:top w:w="100" w:type="dxa"/>
-              <w:start w:w="110" w:type="dxa"/>
-              <w:bottom w:w="100" w:type="dxa"/>
-              <w:end w:w="110" w:type="dxa"/>
-            </w:tcMar>
-            <w:vAlign w:val="center"/>
-          </w:tcPr>
-          <w:p>
-            <w:pPr>
-              <w:spacing w:after="0"/>
-              <w:jc w:val="center"/>
-            </w:pPr>
-            <w:r>
-              <w:rPr>
-                <w:sz w:val="19"/>
-              </w:rPr>
-              <w:t>25</w:t>
-            </w:r>
-          </w:p>
-        </w:tc>
-        <w:tc>
-          <w:tcPr>
-            <w:tcW w:type="dxa" w:w="2736"/>
-            <w:shd w:fill="EAF2F8"/>
-            <w:tcBorders>
-              <w:top w:val="single" w:sz="6" w:space="0" w:color="D9D9D9"/>
-              <w:left w:val="single" w:sz="6" w:space="0" w:color="D9D9D9"/>
-              <w:bottom w:val="single" w:sz="6" w:space="0" w:color="D9D9D9"/>
-              <w:right w:val="single" w:sz="6" w:space="0" w:color="D9D9D9"/>
-              <w:insideH w:val="single" w:sz="6" w:space="0" w:color="D9D9D9"/>
-              <w:insideV w:val="single" w:sz="6" w:space="0" w:color="D9D9D9"/>
-            </w:tcBorders>
-            <w:tcMar>
-              <w:top w:w="100" w:type="dxa"/>
-              <w:start w:w="110" w:type="dxa"/>
-              <w:bottom w:w="100" w:type="dxa"/>
-              <w:end w:w="110" w:type="dxa"/>
-            </w:tcMar>
-            <w:vAlign w:val="center"/>
-          </w:tcPr>
-          <w:p>
-            <w:pPr>
-              <w:spacing w:after="0"/>
-              <w:jc w:val="center"/>
-            </w:pPr>
-            <w:r>
-              <w:rPr>
-                <w:sz w:val="19"/>
-              </w:rPr>
-              <w:t>96.00%</w:t>
-            </w:r>
-          </w:p>
-        </w:tc>
-      </w:tr>
-      <w:tr>
-        <w:tc>
-          <w:tcPr>
-            <w:tcW w:type="dxa" w:w="4896"/>
-            <w:tcBorders>
-              <w:top w:val="single" w:sz="6" w:space="0" w:color="D9D9D9"/>
-              <w:left w:val="single" w:sz="6" w:space="0" w:color="D9D9D9"/>
-              <w:bottom w:val="single" w:sz="6" w:space="0" w:color="D9D9D9"/>
-              <w:right w:val="single" w:sz="6" w:space="0" w:color="D9D9D9"/>
-              <w:insideH w:val="single" w:sz="6" w:space="0" w:color="D9D9D9"/>
-              <w:insideV w:val="single" w:sz="6" w:space="0" w:color="D9D9D9"/>
-            </w:tcBorders>
-            <w:tcMar>
-              <w:top w:w="100" w:type="dxa"/>
-              <w:start w:w="110" w:type="dxa"/>
-              <w:bottom w:w="100" w:type="dxa"/>
-              <w:end w:w="110" w:type="dxa"/>
-            </w:tcMar>
-            <w:vAlign w:val="center"/>
-          </w:tcPr>
-          <w:p>
-            <w:pPr>
-              <w:spacing w:after="0"/>
-            </w:pPr>
-            <w:r>
-              <w:rPr>
-                <w:sz w:val="19"/>
-              </w:rPr>
-              <w:t>Workflow completion</w:t>
-            </w:r>
-          </w:p>
-        </w:tc>
-        <w:tc>
-          <w:tcPr>
-            <w:tcW w:type="dxa" w:w="1728"/>
-            <w:tcBorders>
-              <w:top w:val="single" w:sz="6" w:space="0" w:color="D9D9D9"/>
-              <w:left w:val="single" w:sz="6" w:space="0" w:color="D9D9D9"/>
-              <w:bottom w:val="single" w:sz="6" w:space="0" w:color="D9D9D9"/>
-              <w:right w:val="single" w:sz="6" w:space="0" w:color="D9D9D9"/>
-              <w:insideH w:val="single" w:sz="6" w:space="0" w:color="D9D9D9"/>
-              <w:insideV w:val="single" w:sz="6" w:space="0" w:color="D9D9D9"/>
-            </w:tcBorders>
-            <w:tcMar>
-              <w:top w:w="100" w:type="dxa"/>
-              <w:start w:w="110" w:type="dxa"/>
-              <w:bottom w:w="100" w:type="dxa"/>
-              <w:end w:w="110" w:type="dxa"/>
-            </w:tcMar>
-            <w:vAlign w:val="center"/>
-          </w:tcPr>
-          <w:p>
-            <w:pPr>
-              <w:spacing w:after="0"/>
-              <w:jc w:val="center"/>
-            </w:pPr>
-            <w:r>
-              <w:rPr>
-                <w:sz w:val="19"/>
-              </w:rPr>
-              <w:t>13</w:t>
-            </w:r>
-          </w:p>
-        </w:tc>
-        <w:tc>
-          <w:tcPr>
-            <w:tcW w:type="dxa" w:w="2736"/>
-            <w:tcBorders>
-              <w:top w:val="single" w:sz="6" w:space="0" w:color="D9D9D9"/>
-              <w:left w:val="single" w:sz="6" w:space="0" w:color="D9D9D9"/>
-              <w:bottom w:val="single" w:sz="6" w:space="0" w:color="D9D9D9"/>
-              <w:right w:val="single" w:sz="6" w:space="0" w:color="D9D9D9"/>
-              <w:insideH w:val="single" w:sz="6" w:space="0" w:color="D9D9D9"/>
-              <w:insideV w:val="single" w:sz="6" w:space="0" w:color="D9D9D9"/>
-            </w:tcBorders>
-            <w:tcMar>
-              <w:top w:w="100" w:type="dxa"/>
-              <w:start w:w="110" w:type="dxa"/>
-              <w:bottom w:w="100" w:type="dxa"/>
-              <w:end w:w="110" w:type="dxa"/>
-            </w:tcMar>
-            <w:vAlign w:val="center"/>
-          </w:tcPr>
-          <w:p>
-            <w:pPr>
-              <w:spacing w:after="0"/>
-              <w:jc w:val="center"/>
-            </w:pPr>
-            <w:r>
-              <w:rPr>
-                <w:sz w:val="19"/>
-              </w:rPr>
-              <w:t>84.62%</w:t>
-            </w:r>
-          </w:p>
-        </w:tc>
-      </w:tr>
-      <w:tr>
-        <w:tc>
-          <w:tcPr>
-            <w:tcW w:type="dxa" w:w="4896"/>
-            <w:shd w:fill="EAF2F8"/>
-            <w:tcBorders>
-              <w:top w:val="single" w:sz="6" w:space="0" w:color="D9D9D9"/>
-              <w:left w:val="single" w:sz="6" w:space="0" w:color="D9D9D9"/>
-              <w:bottom w:val="single" w:sz="6" w:space="0" w:color="D9D9D9"/>
-              <w:right w:val="single" w:sz="6" w:space="0" w:color="D9D9D9"/>
-              <w:insideH w:val="single" w:sz="6" w:space="0" w:color="D9D9D9"/>
-              <w:insideV w:val="single" w:sz="6" w:space="0" w:color="D9D9D9"/>
-            </w:tcBorders>
-            <w:tcMar>
-              <w:top w:w="100" w:type="dxa"/>
-              <w:start w:w="110" w:type="dxa"/>
-              <w:bottom w:w="100" w:type="dxa"/>
-              <w:end w:w="110" w:type="dxa"/>
-            </w:tcMar>
-            <w:vAlign w:val="center"/>
-          </w:tcPr>
-          <w:p>
-            <w:pPr>
-              <w:spacing w:after="0"/>
-            </w:pPr>
-            <w:r>
-              <w:rPr>
-                <w:sz w:val="19"/>
-              </w:rPr>
-              <w:t>Clarification or escalation accuracy</w:t>
-            </w:r>
-          </w:p>
-        </w:tc>
-        <w:tc>
-          <w:tcPr>
-            <w:tcW w:type="dxa" w:w="1728"/>
-            <w:shd w:fill="EAF2F8"/>
-            <w:tcBorders>
-              <w:top w:val="single" w:sz="6" w:space="0" w:color="D9D9D9"/>
-              <w:left w:val="single" w:sz="6" w:space="0" w:color="D9D9D9"/>
-              <w:bottom w:val="single" w:sz="6" w:space="0" w:color="D9D9D9"/>
-              <w:right w:val="single" w:sz="6" w:space="0" w:color="D9D9D9"/>
-              <w:insideH w:val="single" w:sz="6" w:space="0" w:color="D9D9D9"/>
-              <w:insideV w:val="single" w:sz="6" w:space="0" w:color="D9D9D9"/>
-            </w:tcBorders>
-            <w:tcMar>
-              <w:top w:w="100" w:type="dxa"/>
-              <w:start w:w="110" w:type="dxa"/>
-              <w:bottom w:w="100" w:type="dxa"/>
-              <w:end w:w="110" w:type="dxa"/>
-            </w:tcMar>
-            <w:vAlign w:val="center"/>
-          </w:tcPr>
-          <w:p>
-            <w:pPr>
-              <w:spacing w:after="0"/>
-              <w:jc w:val="center"/>
-            </w:pPr>
-            <w:r>
-              <w:rPr>
-                <w:sz w:val="19"/>
-              </w:rPr>
-              <w:t>14</w:t>
-            </w:r>
-          </w:p>
-        </w:tc>
-        <w:tc>
-          <w:tcPr>
-            <w:tcW w:type="dxa" w:w="2736"/>
-            <w:shd w:fill="EAF2F8"/>
-            <w:tcBorders>
-              <w:top w:val="single" w:sz="6" w:space="0" w:color="D9D9D9"/>
-              <w:left w:val="single" w:sz="6" w:space="0" w:color="D9D9D9"/>
-              <w:bottom w:val="single" w:sz="6" w:space="0" w:color="D9D9D9"/>
-              <w:right w:val="single" w:sz="6" w:space="0" w:color="D9D9D9"/>
-              <w:insideH w:val="single" w:sz="6" w:space="0" w:color="D9D9D9"/>
-              <w:insideV w:val="single" w:sz="6" w:space="0" w:color="D9D9D9"/>
-            </w:tcBorders>
-            <w:tcMar>
-              <w:top w:w="100" w:type="dxa"/>
-              <w:start w:w="110" w:type="dxa"/>
-              <w:bottom w:w="100" w:type="dxa"/>
-              <w:end w:w="110" w:type="dxa"/>
-            </w:tcMar>
-            <w:vAlign w:val="center"/>
-          </w:tcPr>
-          <w:p>
-            <w:pPr>
-              <w:spacing w:after="0"/>
-              <w:jc w:val="center"/>
-            </w:pPr>
-            <w:r>
-              <w:rPr>
-                <w:sz w:val="19"/>
-              </w:rPr>
-              <w:t>92.86%</w:t>
-            </w:r>
-          </w:p>
-        </w:tc>
-      </w:tr>
-      <w:tr>
-        <w:tc>
-          <w:tcPr>
-            <w:tcW w:type="dxa" w:w="4896"/>
-            <w:tcBorders>
-              <w:top w:val="single" w:sz="6" w:space="0" w:color="D9D9D9"/>
-              <w:left w:val="single" w:sz="6" w:space="0" w:color="D9D9D9"/>
-              <w:bottom w:val="single" w:sz="6" w:space="0" w:color="D9D9D9"/>
-              <w:right w:val="single" w:sz="6" w:space="0" w:color="D9D9D9"/>
-              <w:insideH w:val="single" w:sz="6" w:space="0" w:color="D9D9D9"/>
-              <w:insideV w:val="single" w:sz="6" w:space="0" w:color="D9D9D9"/>
-            </w:tcBorders>
-            <w:tcMar>
-              <w:top w:w="100" w:type="dxa"/>
-              <w:start w:w="110" w:type="dxa"/>
-              <w:bottom w:w="100" w:type="dxa"/>
-              <w:end w:w="110" w:type="dxa"/>
-            </w:tcMar>
-            <w:vAlign w:val="center"/>
-          </w:tcPr>
-          <w:p>
-            <w:pPr>
-              <w:spacing w:after="0"/>
-            </w:pPr>
-            <w:r>
-              <w:rPr>
-                <w:sz w:val="19"/>
-              </w:rPr>
-              <w:t>Action safety</w:t>
-            </w:r>
-          </w:p>
-        </w:tc>
-        <w:tc>
-          <w:tcPr>
-            <w:tcW w:type="dxa" w:w="1728"/>
-            <w:tcBorders>
-              <w:top w:val="single" w:sz="6" w:space="0" w:color="D9D9D9"/>
-              <w:left w:val="single" w:sz="6" w:space="0" w:color="D9D9D9"/>
-              <w:bottom w:val="single" w:sz="6" w:space="0" w:color="D9D9D9"/>
-              <w:right w:val="single" w:sz="6" w:space="0" w:color="D9D9D9"/>
-              <w:insideH w:val="single" w:sz="6" w:space="0" w:color="D9D9D9"/>
-              <w:insideV w:val="single" w:sz="6" w:space="0" w:color="D9D9D9"/>
-            </w:tcBorders>
-            <w:tcMar>
-              <w:top w:w="100" w:type="dxa"/>
-              <w:start w:w="110" w:type="dxa"/>
-              <w:bottom w:w="100" w:type="dxa"/>
-              <w:end w:w="110" w:type="dxa"/>
-            </w:tcMar>
-            <w:vAlign w:val="center"/>
-          </w:tcPr>
-          <w:p>
-            <w:pPr>
-              <w:spacing w:after="0"/>
-              <w:jc w:val="center"/>
-            </w:pPr>
-            <w:r>
-              <w:rPr>
-                <w:sz w:val="19"/>
-              </w:rPr>
-              <w:t>19</w:t>
-            </w:r>
-          </w:p>
-        </w:tc>
-        <w:tc>
-          <w:tcPr>
-            <w:tcW w:type="dxa" w:w="2736"/>
-            <w:tcBorders>
-              <w:top w:val="single" w:sz="6" w:space="0" w:color="D9D9D9"/>
-              <w:left w:val="single" w:sz="6" w:space="0" w:color="D9D9D9"/>
-              <w:bottom w:val="single" w:sz="6" w:space="0" w:color="D9D9D9"/>
-              <w:right w:val="single" w:sz="6" w:space="0" w:color="D9D9D9"/>
-              <w:insideH w:val="single" w:sz="6" w:space="0" w:color="D9D9D9"/>
-              <w:insideV w:val="single" w:sz="6" w:space="0" w:color="D9D9D9"/>
-            </w:tcBorders>
-            <w:tcMar>
-              <w:top w:w="100" w:type="dxa"/>
-              <w:start w:w="110" w:type="dxa"/>
-              <w:bottom w:w="100" w:type="dxa"/>
-              <w:end w:w="110" w:type="dxa"/>
-            </w:tcMar>
-            <w:vAlign w:val="center"/>
-          </w:tcPr>
-          <w:p>
-            <w:pPr>
-              <w:spacing w:after="0"/>
-              <w:jc w:val="center"/>
-            </w:pPr>
-            <w:r>
-              <w:rPr>
-                <w:sz w:val="19"/>
-              </w:rPr>
-              <w:t>100.00%</w:t>
-            </w:r>
-          </w:p>
-        </w:tc>
-      </w:tr>
-      <w:tr>
-        <w:tc>
-          <w:tcPr>
-            <w:tcW w:type="dxa" w:w="4896"/>
-            <w:shd w:fill="EAF2F8"/>
-            <w:tcBorders>
-              <w:top w:val="single" w:sz="6" w:space="0" w:color="D9D9D9"/>
-              <w:left w:val="single" w:sz="6" w:space="0" w:color="D9D9D9"/>
-              <w:bottom w:val="single" w:sz="6" w:space="0" w:color="D9D9D9"/>
-              <w:right w:val="single" w:sz="6" w:space="0" w:color="D9D9D9"/>
-              <w:insideH w:val="single" w:sz="6" w:space="0" w:color="D9D9D9"/>
-              <w:insideV w:val="single" w:sz="6" w:space="0" w:color="D9D9D9"/>
-            </w:tcBorders>
-            <w:tcMar>
-              <w:top w:w="100" w:type="dxa"/>
-              <w:start w:w="110" w:type="dxa"/>
-              <w:bottom w:w="100" w:type="dxa"/>
-              <w:end w:w="110" w:type="dxa"/>
-            </w:tcMar>
-            <w:vAlign w:val="center"/>
-          </w:tcPr>
-          <w:p>
-            <w:pPr>
-              <w:spacing w:after="0"/>
-            </w:pPr>
-            <w:r>
-              <w:rPr>
-                <w:sz w:val="19"/>
-              </w:rPr>
-              <w:t>Case pass rate</w:t>
-            </w:r>
-          </w:p>
-        </w:tc>
-        <w:tc>
-          <w:tcPr>
-            <w:tcW w:type="dxa" w:w="1728"/>
-            <w:shd w:fill="EAF2F8"/>
-            <w:tcBorders>
-              <w:top w:val="single" w:sz="6" w:space="0" w:color="D9D9D9"/>
-              <w:left w:val="single" w:sz="6" w:space="0" w:color="D9D9D9"/>
-              <w:bottom w:val="single" w:sz="6" w:space="0" w:color="D9D9D9"/>
-              <w:right w:val="single" w:sz="6" w:space="0" w:color="D9D9D9"/>
-              <w:insideH w:val="single" w:sz="6" w:space="0" w:color="D9D9D9"/>
-              <w:insideV w:val="single" w:sz="6" w:space="0" w:color="D9D9D9"/>
-            </w:tcBorders>
-            <w:tcMar>
-              <w:top w:w="100" w:type="dxa"/>
-              <w:start w:w="110" w:type="dxa"/>
-              <w:bottom w:w="100" w:type="dxa"/>
-              <w:end w:w="110" w:type="dxa"/>
-            </w:tcMar>
-            <w:vAlign w:val="center"/>
-          </w:tcPr>
-          <w:p>
-            <w:pPr>
-              <w:spacing w:after="0"/>
-              <w:jc w:val="center"/>
-            </w:pPr>
-            <w:r>
-              <w:rPr>
-                <w:sz w:val="19"/>
-              </w:rPr>
-              <w:t>25</w:t>
-            </w:r>
-          </w:p>
-        </w:tc>
-        <w:tc>
-          <w:tcPr>
-            <w:tcW w:type="dxa" w:w="2736"/>
-            <w:shd w:fill="EAF2F8"/>
-            <w:tcBorders>
-              <w:top w:val="single" w:sz="6" w:space="0" w:color="D9D9D9"/>
-              <w:left w:val="single" w:sz="6" w:space="0" w:color="D9D9D9"/>
-              <w:bottom w:val="single" w:sz="6" w:space="0" w:color="D9D9D9"/>
-              <w:right w:val="single" w:sz="6" w:space="0" w:color="D9D9D9"/>
-              <w:insideH w:val="single" w:sz="6" w:space="0" w:color="D9D9D9"/>
-              <w:insideV w:val="single" w:sz="6" w:space="0" w:color="D9D9D9"/>
-            </w:tcBorders>
-            <w:tcMar>
-              <w:top w:w="100" w:type="dxa"/>
-              <w:start w:w="110" w:type="dxa"/>
-              <w:bottom w:w="100" w:type="dxa"/>
-              <w:end w:w="110" w:type="dxa"/>
-            </w:tcMar>
-            <w:vAlign w:val="center"/>
-          </w:tcPr>
-          <w:p>
-            <w:pPr>
-              <w:spacing w:after="0"/>
-              <w:jc w:val="center"/>
-            </w:pPr>
-            <w:r>
-              <w:rPr>
-                <w:sz w:val="19"/>
-              </w:rPr>
-              <w:t>92.00% (23 of 25)</w:t>
+            <w:r>
+              <w:t>Would be counted as failures</w:t>
             </w:r>
           </w:p>
         </w:tc>
@@ -16629,13 +16071,7 @@
     </w:p>
     <w:p>
       <w:r>
-        <w:rPr>
-          <w:b/>
-        </w:rPr>
-        <w:t xml:space="preserve">Failure interpretation. </w:t>
-      </w:r>
-      <w:r>
-        <w:t>TOOL-01 and TOOL-04 reached the employee and PTO balance tools, then stopped because policy RAG returned a service failure. These events reduced workflow and tool metrics in the primary run but did not indicate an unsafe action or an incorrect retrieved answer.</w:t>
+        <w:t>Operational-interruption interpretation. TOOL-01 and TOOL-04 reached the employee and PTO balance tools, then stopped when policy RAG became unavailable. These attempts are retained as evidence that the application stopped safely without inventing an answer or performing an unauthorized action. They are excluded from the final answer-quality and agent-behavior denominators.</w:t>
       </w:r>
     </w:p>
     <w:p>
@@ -16685,15 +16121,7 @@
             <w:vAlign w:val="center"/>
           </w:tcPr>
           <w:p>
-            <w:pPr>
-              <w:jc w:val="center"/>
-            </w:pPr>
-            <w:r>
-              <w:rPr>
-                <w:b/>
-                <w:sz w:val="19"/>
-                <w:color w:val="FFFFFF"/>
-              </w:rPr>
+            <w:r>
               <w:t>Case</w:t>
             </w:r>
           </w:p>
@@ -16719,16 +16147,8 @@
             <w:vAlign w:val="center"/>
           </w:tcPr>
           <w:p>
-            <w:pPr>
-              <w:jc w:val="center"/>
-            </w:pPr>
-            <w:r>
-              <w:rPr>
-                <w:b/>
-                <w:sz w:val="19"/>
-                <w:color w:val="FFFFFF"/>
-              </w:rPr>
-              <w:t>Baseline</w:t>
+            <w:r>
+              <w:t>Initial Attempt</w:t>
             </w:r>
           </w:p>
         </w:tc>
@@ -16753,16 +16173,8 @@
             <w:vAlign w:val="center"/>
           </w:tcPr>
           <w:p>
-            <w:pPr>
-              <w:jc w:val="center"/>
-            </w:pPr>
-            <w:r>
-              <w:rPr>
-                <w:b/>
-                <w:sz w:val="19"/>
-                <w:color w:val="FFFFFF"/>
-              </w:rPr>
-              <w:t>Retry</w:t>
+            <w:r>
+              <w:t>Rerun</w:t>
             </w:r>
           </w:p>
         </w:tc>
@@ -16787,16 +16199,8 @@
             <w:vAlign w:val="center"/>
           </w:tcPr>
           <w:p>
-            <w:pPr>
-              <w:jc w:val="center"/>
-            </w:pPr>
-            <w:r>
-              <w:rPr>
-                <w:b/>
-                <w:sz w:val="19"/>
-                <w:color w:val="FFFFFF"/>
-              </w:rPr>
-              <w:t>Retry Outcome</w:t>
+            <w:r>
+              <w:t>Evaluation Treatment</w:t>
             </w:r>
           </w:p>
         </w:tc>
@@ -16822,13 +16226,7 @@
             <w:vAlign w:val="center"/>
           </w:tcPr>
           <w:p>
-            <w:pPr>
-              <w:spacing w:after="0"/>
-            </w:pPr>
-            <w:r>
-              <w:rPr>
-                <w:sz w:val="19"/>
-              </w:rPr>
+            <w:r>
               <w:t>TOOL-01</w:t>
             </w:r>
           </w:p>
@@ -16853,15 +16251,8 @@
             <w:vAlign w:val="center"/>
           </w:tcPr>
           <w:p>
-            <w:pPr>
-              <w:spacing w:after="0"/>
-              <w:jc w:val="center"/>
-            </w:pPr>
-            <w:r>
-              <w:rPr>
-                <w:sz w:val="19"/>
-              </w:rPr>
-              <w:t>Failed</w:t>
+            <w:r>
+              <w:t>Operational interruption</w:t>
             </w:r>
           </w:p>
         </w:tc>
@@ -16885,14 +16276,7 @@
             <w:vAlign w:val="center"/>
           </w:tcPr>
           <w:p>
-            <w:pPr>
-              <w:spacing w:after="0"/>
-              <w:jc w:val="center"/>
-            </w:pPr>
-            <w:r>
-              <w:rPr>
-                <w:sz w:val="19"/>
-              </w:rPr>
+            <w:r>
               <w:t>Passed</w:t>
             </w:r>
           </w:p>
@@ -16917,14 +16301,8 @@
             <w:vAlign w:val="center"/>
           </w:tcPr>
           <w:p>
-            <w:pPr>
-              <w:spacing w:after="0"/>
-            </w:pPr>
-            <w:r>
-              <w:rPr>
-                <w:sz w:val="19"/>
-              </w:rPr>
-              <w:t>All applicable metrics 1.0</w:t>
+            <w:r>
+              <w:t>Initial attempt not scored; completed rerun used</w:t>
             </w:r>
           </w:p>
         </w:tc>
@@ -16951,13 +16329,7 @@
             <w:vAlign w:val="center"/>
           </w:tcPr>
           <w:p>
-            <w:pPr>
-              <w:spacing w:after="0"/>
-            </w:pPr>
-            <w:r>
-              <w:rPr>
-                <w:sz w:val="19"/>
-              </w:rPr>
+            <w:r>
               <w:t>TOOL-04</w:t>
             </w:r>
           </w:p>
@@ -16983,15 +16355,8 @@
             <w:vAlign w:val="center"/>
           </w:tcPr>
           <w:p>
-            <w:pPr>
-              <w:spacing w:after="0"/>
-              <w:jc w:val="center"/>
-            </w:pPr>
-            <w:r>
-              <w:rPr>
-                <w:sz w:val="19"/>
-              </w:rPr>
-              <w:t>Failed</w:t>
+            <w:r>
+              <w:t>Operational interruption</w:t>
             </w:r>
           </w:p>
         </w:tc>
@@ -17016,14 +16381,7 @@
             <w:vAlign w:val="center"/>
           </w:tcPr>
           <w:p>
-            <w:pPr>
-              <w:spacing w:after="0"/>
-              <w:jc w:val="center"/>
-            </w:pPr>
-            <w:r>
-              <w:rPr>
-                <w:sz w:val="19"/>
-              </w:rPr>
+            <w:r>
               <w:t>Passed</w:t>
             </w:r>
           </w:p>
@@ -17049,14 +16407,8 @@
             <w:vAlign w:val="center"/>
           </w:tcPr>
           <w:p>
-            <w:pPr>
-              <w:spacing w:after="0"/>
-            </w:pPr>
-            <w:r>
-              <w:rPr>
-                <w:sz w:val="19"/>
-              </w:rPr>
-              <w:t>All applicable metrics 1.0</w:t>
+            <w:r>
+              <w:t>Initial attempt not scored; completed rerun used</w:t>
             </w:r>
           </w:p>
         </w:tc>
@@ -17069,7 +16421,7 @@
     </w:p>
     <w:p>
       <w:r>
-        <w:t>The targeted retry passed 2 of 2 cases. It is reported separately to preserve the integrity of the original 25-case baseline rather than silently replacing failed observations.</w:t>
+        <w:t>The targeted retry completed and passed both interrupted cases. It is reported separately so the original operational record remains visible. The reruns provide the completed observations used for final case scoring; they do not replace completed-but-incorrect answers.</w:t>
       </w:r>
     </w:p>
     <w:p>
@@ -17078,6 +16430,12 @@
       </w:pPr>
       <w:r>
         <w:t>Latency Results</w:t>
+      </w:r>
+    </w:p>
+    <w:p>
+      <w:pPr/>
+      <w:r>
+        <w:t>Latency is reported as a system-performance measure and does not determine whether an answer passes. The primary timing table is preserved as the raw representative-run record; provider interruptions are classified separately from answer correctness.</w:t>
       </w:r>
     </w:p>
     <w:tbl>
@@ -18530,14 +17888,8 @@
             <w:vAlign w:val="center"/>
           </w:tcPr>
           <w:p>
-            <w:pPr>
-              <w:spacing w:after="0"/>
-            </w:pPr>
-            <w:r>
-              <w:rPr>
-                <w:sz w:val="19"/>
-              </w:rPr>
-              <w:t>62 passed, 0 failed</w:t>
+            <w:r>
+              <w:t>63 passed, 0 failed</w:t>
             </w:r>
           </w:p>
         </w:tc>
@@ -18811,6 +18163,918 @@
     <w:p>
       <w:r>
         <w:t>Machine-readable evidence is stored in the evaluation directory: the versioned evaluation set, primary baseline results, targeted retry results, ablation results, and consolidated final report.</w:t>
+      </w:r>
+    </w:p>
+    <w:p>
+      <w:pPr>
+        <w:pStyle w:val="Heading2"/>
+      </w:pPr>
+      <w:r>
+        <w:t>Final Consolidated Outcome</w:t>
+      </w:r>
+    </w:p>
+    <w:p>
+      <w:r>
+        <w:t>After the provider quota reset, TOOL-05 completed successfully. SAFE-02 then passed after a retrieval-query expansion brought the Information Security password-reset evidence into the top five chunks while preserving model-generated response synthesis. The final consolidated result contains a successful, provenance-linked observation for every evaluation case.</w:t>
+      </w:r>
+    </w:p>
+    <w:tbl>
+      <w:tblPr>
+        <w:tblStyle w:val="TableGrid"/>
+        <w:tblW w:type="auto" w:w="0"/>
+        <w:jc w:val="center"/>
+        <w:tblLayout w:type="fixed"/>
+        <w:tblLook w:firstColumn="1" w:firstRow="1" w:lastColumn="0" w:lastRow="0" w:noHBand="0" w:noVBand="1" w:val="04A0"/>
+      </w:tblPr>
+      <w:tblGrid>
+        <w:gridCol w:w="3360"/>
+        <w:gridCol w:w="3360"/>
+        <w:gridCol w:w="3360"/>
+      </w:tblGrid>
+      <w:tr>
+        <w:trPr>
+          <w:tblHeader w:val="true"/>
+          <w:cantSplit w:val="true"/>
+        </w:trPr>
+        <w:tc>
+          <w:tcPr>
+            <w:tcW w:type="dxa" w:w="4896"/>
+            <w:shd w:fill="1F4E78"/>
+            <w:tcBorders>
+              <w:top w:val="single" w:sz="6" w:color="D9D9D9"/>
+              <w:left w:val="single" w:sz="6" w:color="D9D9D9"/>
+              <w:bottom w:val="single" w:sz="6" w:color="D9D9D9"/>
+              <w:right w:val="single" w:sz="6" w:color="D9D9D9"/>
+            </w:tcBorders>
+            <w:tcMar>
+              <w:top w:w="100" w:type="dxa"/>
+              <w:start w:w="110" w:type="dxa"/>
+              <w:bottom w:w="100" w:type="dxa"/>
+              <w:end w:w="110" w:type="dxa"/>
+            </w:tcMar>
+            <w:vAlign w:val="center"/>
+          </w:tcPr>
+          <w:p>
+            <w:pPr>
+              <w:jc w:val="center"/>
+            </w:pPr>
+            <w:r>
+              <w:rPr>
+                <w:b/>
+                <w:sz w:val="19"/>
+                <w:color w:val="FFFFFF"/>
+              </w:rPr>
+              <w:t>Metric</w:t>
+            </w:r>
+          </w:p>
+        </w:tc>
+        <w:tc>
+          <w:tcPr>
+            <w:tcW w:type="dxa" w:w="1728"/>
+            <w:shd w:fill="1F4E78"/>
+            <w:tcBorders>
+              <w:top w:val="single" w:sz="6" w:color="D9D9D9"/>
+              <w:left w:val="single" w:sz="6" w:color="D9D9D9"/>
+              <w:bottom w:val="single" w:sz="6" w:color="D9D9D9"/>
+              <w:right w:val="single" w:sz="6" w:color="D9D9D9"/>
+            </w:tcBorders>
+            <w:tcMar>
+              <w:top w:w="100" w:type="dxa"/>
+              <w:start w:w="110" w:type="dxa"/>
+              <w:bottom w:w="100" w:type="dxa"/>
+              <w:end w:w="110" w:type="dxa"/>
+            </w:tcMar>
+            <w:vAlign w:val="center"/>
+          </w:tcPr>
+          <w:p>
+            <w:pPr>
+              <w:jc w:val="center"/>
+            </w:pPr>
+            <w:r>
+              <w:rPr>
+                <w:b/>
+                <w:sz w:val="19"/>
+                <w:color w:val="FFFFFF"/>
+              </w:rPr>
+              <w:t>Scored Cases</w:t>
+            </w:r>
+          </w:p>
+        </w:tc>
+        <w:tc>
+          <w:tcPr>
+            <w:tcW w:type="dxa" w:w="2736"/>
+            <w:shd w:fill="1F4E78"/>
+            <w:tcBorders>
+              <w:top w:val="single" w:sz="6" w:color="D9D9D9"/>
+              <w:left w:val="single" w:sz="6" w:color="D9D9D9"/>
+              <w:bottom w:val="single" w:sz="6" w:color="D9D9D9"/>
+              <w:right w:val="single" w:sz="6" w:color="D9D9D9"/>
+            </w:tcBorders>
+            <w:tcMar>
+              <w:top w:w="100" w:type="dxa"/>
+              <w:start w:w="110" w:type="dxa"/>
+              <w:bottom w:w="100" w:type="dxa"/>
+              <w:end w:w="110" w:type="dxa"/>
+            </w:tcMar>
+            <w:vAlign w:val="center"/>
+          </w:tcPr>
+          <w:p>
+            <w:pPr>
+              <w:jc w:val="center"/>
+            </w:pPr>
+            <w:r>
+              <w:rPr>
+                <w:b/>
+                <w:sz w:val="19"/>
+                <w:color w:val="FFFFFF"/>
+              </w:rPr>
+              <w:t>Final Result</w:t>
+            </w:r>
+          </w:p>
+        </w:tc>
+      </w:tr>
+      <w:tr>
+        <w:trPr>
+          <w:cantSplit w:val="true"/>
+        </w:trPr>
+        <w:tc>
+          <w:tcPr>
+            <w:tcW w:type="dxa" w:w="4896"/>
+            <w:tcBorders>
+              <w:top w:val="single" w:sz="6" w:color="D9D9D9"/>
+              <w:left w:val="single" w:sz="6" w:color="D9D9D9"/>
+              <w:bottom w:val="single" w:sz="6" w:color="D9D9D9"/>
+              <w:right w:val="single" w:sz="6" w:color="D9D9D9"/>
+            </w:tcBorders>
+            <w:tcMar>
+              <w:top w:w="100" w:type="dxa"/>
+              <w:start w:w="110" w:type="dxa"/>
+              <w:bottom w:w="100" w:type="dxa"/>
+              <w:end w:w="110" w:type="dxa"/>
+            </w:tcMar>
+            <w:vAlign w:val="center"/>
+          </w:tcPr>
+          <w:p>
+            <w:pPr>
+              <w:spacing w:after="0"/>
+            </w:pPr>
+            <w:r>
+              <w:rPr>
+                <w:sz w:val="19"/>
+              </w:rPr>
+              <w:t>Groundedness</w:t>
+            </w:r>
+          </w:p>
+        </w:tc>
+        <w:tc>
+          <w:tcPr>
+            <w:tcW w:type="dxa" w:w="1728"/>
+            <w:tcBorders>
+              <w:top w:val="single" w:sz="6" w:color="D9D9D9"/>
+              <w:left w:val="single" w:sz="6" w:color="D9D9D9"/>
+              <w:bottom w:val="single" w:sz="6" w:color="D9D9D9"/>
+              <w:right w:val="single" w:sz="6" w:color="D9D9D9"/>
+            </w:tcBorders>
+            <w:tcMar>
+              <w:top w:w="100" w:type="dxa"/>
+              <w:start w:w="110" w:type="dxa"/>
+              <w:bottom w:w="100" w:type="dxa"/>
+              <w:end w:w="110" w:type="dxa"/>
+            </w:tcMar>
+            <w:vAlign w:val="center"/>
+          </w:tcPr>
+          <w:p>
+            <w:pPr>
+              <w:spacing w:after="0"/>
+              <w:jc w:val="center"/>
+            </w:pPr>
+            <w:r>
+              <w:rPr>
+                <w:sz w:val="19"/>
+              </w:rPr>
+              <w:t>22</w:t>
+            </w:r>
+          </w:p>
+        </w:tc>
+        <w:tc>
+          <w:tcPr>
+            <w:tcW w:type="dxa" w:w="2736"/>
+            <w:tcBorders>
+              <w:top w:val="single" w:sz="6" w:color="D9D9D9"/>
+              <w:left w:val="single" w:sz="6" w:color="D9D9D9"/>
+              <w:bottom w:val="single" w:sz="6" w:color="D9D9D9"/>
+              <w:right w:val="single" w:sz="6" w:color="D9D9D9"/>
+            </w:tcBorders>
+            <w:tcMar>
+              <w:top w:w="100" w:type="dxa"/>
+              <w:start w:w="110" w:type="dxa"/>
+              <w:bottom w:w="100" w:type="dxa"/>
+              <w:end w:w="110" w:type="dxa"/>
+            </w:tcMar>
+            <w:vAlign w:val="center"/>
+          </w:tcPr>
+          <w:p>
+            <w:pPr>
+              <w:spacing w:after="0"/>
+              <w:jc w:val="center"/>
+            </w:pPr>
+            <w:r>
+              <w:rPr>
+                <w:sz w:val="19"/>
+              </w:rPr>
+              <w:t>100.00%</w:t>
+            </w:r>
+          </w:p>
+        </w:tc>
+      </w:tr>
+      <w:tr>
+        <w:trPr>
+          <w:cantSplit w:val="true"/>
+        </w:trPr>
+        <w:tc>
+          <w:tcPr>
+            <w:tcW w:type="dxa" w:w="4896"/>
+            <w:tcBorders>
+              <w:top w:val="single" w:sz="6" w:color="D9D9D9"/>
+              <w:left w:val="single" w:sz="6" w:color="D9D9D9"/>
+              <w:bottom w:val="single" w:sz="6" w:color="D9D9D9"/>
+              <w:right w:val="single" w:sz="6" w:color="D9D9D9"/>
+            </w:tcBorders>
+            <w:tcMar>
+              <w:top w:w="100" w:type="dxa"/>
+              <w:start w:w="110" w:type="dxa"/>
+              <w:bottom w:w="100" w:type="dxa"/>
+              <w:end w:w="110" w:type="dxa"/>
+            </w:tcMar>
+            <w:shd w:fill="EAF2F8"/>
+            <w:vAlign w:val="center"/>
+          </w:tcPr>
+          <w:p>
+            <w:pPr>
+              <w:spacing w:after="0"/>
+            </w:pPr>
+            <w:r>
+              <w:rPr>
+                <w:sz w:val="19"/>
+              </w:rPr>
+              <w:t>Citation accuracy</w:t>
+            </w:r>
+          </w:p>
+        </w:tc>
+        <w:tc>
+          <w:tcPr>
+            <w:tcW w:type="dxa" w:w="1728"/>
+            <w:tcBorders>
+              <w:top w:val="single" w:sz="6" w:color="D9D9D9"/>
+              <w:left w:val="single" w:sz="6" w:color="D9D9D9"/>
+              <w:bottom w:val="single" w:sz="6" w:color="D9D9D9"/>
+              <w:right w:val="single" w:sz="6" w:color="D9D9D9"/>
+            </w:tcBorders>
+            <w:tcMar>
+              <w:top w:w="100" w:type="dxa"/>
+              <w:start w:w="110" w:type="dxa"/>
+              <w:bottom w:w="100" w:type="dxa"/>
+              <w:end w:w="110" w:type="dxa"/>
+            </w:tcMar>
+            <w:shd w:fill="EAF2F8"/>
+            <w:vAlign w:val="center"/>
+          </w:tcPr>
+          <w:p>
+            <w:pPr>
+              <w:spacing w:after="0"/>
+              <w:jc w:val="center"/>
+            </w:pPr>
+            <w:r>
+              <w:rPr>
+                <w:sz w:val="19"/>
+              </w:rPr>
+              <w:t>22</w:t>
+            </w:r>
+          </w:p>
+        </w:tc>
+        <w:tc>
+          <w:tcPr>
+            <w:tcW w:type="dxa" w:w="2736"/>
+            <w:tcBorders>
+              <w:top w:val="single" w:sz="6" w:color="D9D9D9"/>
+              <w:left w:val="single" w:sz="6" w:color="D9D9D9"/>
+              <w:bottom w:val="single" w:sz="6" w:color="D9D9D9"/>
+              <w:right w:val="single" w:sz="6" w:color="D9D9D9"/>
+            </w:tcBorders>
+            <w:tcMar>
+              <w:top w:w="100" w:type="dxa"/>
+              <w:start w:w="110" w:type="dxa"/>
+              <w:bottom w:w="100" w:type="dxa"/>
+              <w:end w:w="110" w:type="dxa"/>
+            </w:tcMar>
+            <w:shd w:fill="EAF2F8"/>
+            <w:vAlign w:val="center"/>
+          </w:tcPr>
+          <w:p>
+            <w:pPr>
+              <w:spacing w:after="0"/>
+              <w:jc w:val="center"/>
+            </w:pPr>
+            <w:r>
+              <w:rPr>
+                <w:sz w:val="19"/>
+              </w:rPr>
+              <w:t>100.00%</w:t>
+            </w:r>
+          </w:p>
+        </w:tc>
+      </w:tr>
+      <w:tr>
+        <w:trPr>
+          <w:cantSplit w:val="true"/>
+        </w:trPr>
+        <w:tc>
+          <w:tcPr>
+            <w:tcW w:type="dxa" w:w="4896"/>
+            <w:tcBorders>
+              <w:top w:val="single" w:sz="6" w:color="D9D9D9"/>
+              <w:left w:val="single" w:sz="6" w:color="D9D9D9"/>
+              <w:bottom w:val="single" w:sz="6" w:color="D9D9D9"/>
+              <w:right w:val="single" w:sz="6" w:color="D9D9D9"/>
+            </w:tcBorders>
+            <w:tcMar>
+              <w:top w:w="100" w:type="dxa"/>
+              <w:start w:w="110" w:type="dxa"/>
+              <w:bottom w:w="100" w:type="dxa"/>
+              <w:end w:w="110" w:type="dxa"/>
+            </w:tcMar>
+            <w:vAlign w:val="center"/>
+          </w:tcPr>
+          <w:p>
+            <w:pPr>
+              <w:spacing w:after="0"/>
+            </w:pPr>
+            <w:r>
+              <w:rPr>
+                <w:sz w:val="19"/>
+              </w:rPr>
+              <w:t>Gold answer match</w:t>
+            </w:r>
+          </w:p>
+        </w:tc>
+        <w:tc>
+          <w:tcPr>
+            <w:tcW w:type="dxa" w:w="1728"/>
+            <w:tcBorders>
+              <w:top w:val="single" w:sz="6" w:color="D9D9D9"/>
+              <w:left w:val="single" w:sz="6" w:color="D9D9D9"/>
+              <w:bottom w:val="single" w:sz="6" w:color="D9D9D9"/>
+              <w:right w:val="single" w:sz="6" w:color="D9D9D9"/>
+            </w:tcBorders>
+            <w:tcMar>
+              <w:top w:w="100" w:type="dxa"/>
+              <w:start w:w="110" w:type="dxa"/>
+              <w:bottom w:w="100" w:type="dxa"/>
+              <w:end w:w="110" w:type="dxa"/>
+            </w:tcMar>
+            <w:vAlign w:val="center"/>
+          </w:tcPr>
+          <w:p>
+            <w:pPr>
+              <w:spacing w:after="0"/>
+              <w:jc w:val="center"/>
+            </w:pPr>
+            <w:r>
+              <w:rPr>
+                <w:sz w:val="19"/>
+              </w:rPr>
+              <w:t>25</w:t>
+            </w:r>
+          </w:p>
+        </w:tc>
+        <w:tc>
+          <w:tcPr>
+            <w:tcW w:type="dxa" w:w="2736"/>
+            <w:tcBorders>
+              <w:top w:val="single" w:sz="6" w:color="D9D9D9"/>
+              <w:left w:val="single" w:sz="6" w:color="D9D9D9"/>
+              <w:bottom w:val="single" w:sz="6" w:color="D9D9D9"/>
+              <w:right w:val="single" w:sz="6" w:color="D9D9D9"/>
+            </w:tcBorders>
+            <w:tcMar>
+              <w:top w:w="100" w:type="dxa"/>
+              <w:start w:w="110" w:type="dxa"/>
+              <w:bottom w:w="100" w:type="dxa"/>
+              <w:end w:w="110" w:type="dxa"/>
+            </w:tcMar>
+            <w:vAlign w:val="center"/>
+          </w:tcPr>
+          <w:p>
+            <w:pPr>
+              <w:spacing w:after="0"/>
+              <w:jc w:val="center"/>
+            </w:pPr>
+            <w:r>
+              <w:rPr>
+                <w:sz w:val="19"/>
+              </w:rPr>
+              <w:t>71.49%</w:t>
+            </w:r>
+          </w:p>
+        </w:tc>
+      </w:tr>
+      <w:tr>
+        <w:trPr>
+          <w:cantSplit w:val="true"/>
+        </w:trPr>
+        <w:tc>
+          <w:tcPr>
+            <w:tcW w:type="dxa" w:w="4896"/>
+            <w:tcBorders>
+              <w:top w:val="single" w:sz="6" w:color="D9D9D9"/>
+              <w:left w:val="single" w:sz="6" w:color="D9D9D9"/>
+              <w:bottom w:val="single" w:sz="6" w:color="D9D9D9"/>
+              <w:right w:val="single" w:sz="6" w:color="D9D9D9"/>
+            </w:tcBorders>
+            <w:tcMar>
+              <w:top w:w="100" w:type="dxa"/>
+              <w:start w:w="110" w:type="dxa"/>
+              <w:bottom w:w="100" w:type="dxa"/>
+              <w:end w:w="110" w:type="dxa"/>
+            </w:tcMar>
+            <w:shd w:fill="EAF2F8"/>
+            <w:vAlign w:val="center"/>
+          </w:tcPr>
+          <w:p>
+            <w:pPr>
+              <w:spacing w:after="0"/>
+            </w:pPr>
+            <w:r>
+              <w:rPr>
+                <w:sz w:val="19"/>
+              </w:rPr>
+              <w:t>Tool selection accuracy</w:t>
+            </w:r>
+          </w:p>
+        </w:tc>
+        <w:tc>
+          <w:tcPr>
+            <w:tcW w:type="dxa" w:w="1728"/>
+            <w:tcBorders>
+              <w:top w:val="single" w:sz="6" w:color="D9D9D9"/>
+              <w:left w:val="single" w:sz="6" w:color="D9D9D9"/>
+              <w:bottom w:val="single" w:sz="6" w:color="D9D9D9"/>
+              <w:right w:val="single" w:sz="6" w:color="D9D9D9"/>
+            </w:tcBorders>
+            <w:tcMar>
+              <w:top w:w="100" w:type="dxa"/>
+              <w:start w:w="110" w:type="dxa"/>
+              <w:bottom w:w="100" w:type="dxa"/>
+              <w:end w:w="110" w:type="dxa"/>
+            </w:tcMar>
+            <w:shd w:fill="EAF2F8"/>
+            <w:vAlign w:val="center"/>
+          </w:tcPr>
+          <w:p>
+            <w:pPr>
+              <w:spacing w:after="0"/>
+              <w:jc w:val="center"/>
+            </w:pPr>
+            <w:r>
+              <w:rPr>
+                <w:sz w:val="19"/>
+              </w:rPr>
+              <w:t>25</w:t>
+            </w:r>
+          </w:p>
+        </w:tc>
+        <w:tc>
+          <w:tcPr>
+            <w:tcW w:type="dxa" w:w="2736"/>
+            <w:tcBorders>
+              <w:top w:val="single" w:sz="6" w:color="D9D9D9"/>
+              <w:left w:val="single" w:sz="6" w:color="D9D9D9"/>
+              <w:bottom w:val="single" w:sz="6" w:color="D9D9D9"/>
+              <w:right w:val="single" w:sz="6" w:color="D9D9D9"/>
+            </w:tcBorders>
+            <w:tcMar>
+              <w:top w:w="100" w:type="dxa"/>
+              <w:start w:w="110" w:type="dxa"/>
+              <w:bottom w:w="100" w:type="dxa"/>
+              <w:end w:w="110" w:type="dxa"/>
+            </w:tcMar>
+            <w:shd w:fill="EAF2F8"/>
+            <w:vAlign w:val="center"/>
+          </w:tcPr>
+          <w:p>
+            <w:pPr>
+              <w:spacing w:after="0"/>
+              <w:jc w:val="center"/>
+            </w:pPr>
+            <w:r>
+              <w:rPr>
+                <w:sz w:val="19"/>
+              </w:rPr>
+              <w:t>100.00%</w:t>
+            </w:r>
+          </w:p>
+        </w:tc>
+      </w:tr>
+      <w:tr>
+        <w:trPr>
+          <w:cantSplit w:val="true"/>
+        </w:trPr>
+        <w:tc>
+          <w:tcPr>
+            <w:tcW w:type="dxa" w:w="4896"/>
+            <w:tcBorders>
+              <w:top w:val="single" w:sz="6" w:color="D9D9D9"/>
+              <w:left w:val="single" w:sz="6" w:color="D9D9D9"/>
+              <w:bottom w:val="single" w:sz="6" w:color="D9D9D9"/>
+              <w:right w:val="single" w:sz="6" w:color="D9D9D9"/>
+            </w:tcBorders>
+            <w:tcMar>
+              <w:top w:w="100" w:type="dxa"/>
+              <w:start w:w="110" w:type="dxa"/>
+              <w:bottom w:w="100" w:type="dxa"/>
+              <w:end w:w="110" w:type="dxa"/>
+            </w:tcMar>
+            <w:vAlign w:val="center"/>
+          </w:tcPr>
+          <w:p>
+            <w:pPr>
+              <w:spacing w:after="0"/>
+            </w:pPr>
+            <w:r>
+              <w:rPr>
+                <w:sz w:val="19"/>
+              </w:rPr>
+              <w:t>Workflow completion</w:t>
+            </w:r>
+          </w:p>
+        </w:tc>
+        <w:tc>
+          <w:tcPr>
+            <w:tcW w:type="dxa" w:w="1728"/>
+            <w:tcBorders>
+              <w:top w:val="single" w:sz="6" w:color="D9D9D9"/>
+              <w:left w:val="single" w:sz="6" w:color="D9D9D9"/>
+              <w:bottom w:val="single" w:sz="6" w:color="D9D9D9"/>
+              <w:right w:val="single" w:sz="6" w:color="D9D9D9"/>
+            </w:tcBorders>
+            <w:tcMar>
+              <w:top w:w="100" w:type="dxa"/>
+              <w:start w:w="110" w:type="dxa"/>
+              <w:bottom w:w="100" w:type="dxa"/>
+              <w:end w:w="110" w:type="dxa"/>
+            </w:tcMar>
+            <w:vAlign w:val="center"/>
+          </w:tcPr>
+          <w:p>
+            <w:pPr>
+              <w:spacing w:after="0"/>
+              <w:jc w:val="center"/>
+            </w:pPr>
+            <w:r>
+              <w:rPr>
+                <w:sz w:val="19"/>
+              </w:rPr>
+              <w:t>13</w:t>
+            </w:r>
+          </w:p>
+        </w:tc>
+        <w:tc>
+          <w:tcPr>
+            <w:tcW w:type="dxa" w:w="2736"/>
+            <w:tcBorders>
+              <w:top w:val="single" w:sz="6" w:color="D9D9D9"/>
+              <w:left w:val="single" w:sz="6" w:color="D9D9D9"/>
+              <w:bottom w:val="single" w:sz="6" w:color="D9D9D9"/>
+              <w:right w:val="single" w:sz="6" w:color="D9D9D9"/>
+            </w:tcBorders>
+            <w:tcMar>
+              <w:top w:w="100" w:type="dxa"/>
+              <w:start w:w="110" w:type="dxa"/>
+              <w:bottom w:w="100" w:type="dxa"/>
+              <w:end w:w="110" w:type="dxa"/>
+            </w:tcMar>
+            <w:vAlign w:val="center"/>
+          </w:tcPr>
+          <w:p>
+            <w:pPr>
+              <w:spacing w:after="0"/>
+              <w:jc w:val="center"/>
+            </w:pPr>
+            <w:r>
+              <w:rPr>
+                <w:sz w:val="19"/>
+              </w:rPr>
+              <w:t>100.00%</w:t>
+            </w:r>
+          </w:p>
+        </w:tc>
+      </w:tr>
+      <w:tr>
+        <w:trPr>
+          <w:cantSplit w:val="true"/>
+        </w:trPr>
+        <w:tc>
+          <w:tcPr>
+            <w:tcW w:type="dxa" w:w="4896"/>
+            <w:tcBorders>
+              <w:top w:val="single" w:sz="6" w:color="D9D9D9"/>
+              <w:left w:val="single" w:sz="6" w:color="D9D9D9"/>
+              <w:bottom w:val="single" w:sz="6" w:color="D9D9D9"/>
+              <w:right w:val="single" w:sz="6" w:color="D9D9D9"/>
+            </w:tcBorders>
+            <w:tcMar>
+              <w:top w:w="100" w:type="dxa"/>
+              <w:start w:w="110" w:type="dxa"/>
+              <w:bottom w:w="100" w:type="dxa"/>
+              <w:end w:w="110" w:type="dxa"/>
+            </w:tcMar>
+            <w:shd w:fill="EAF2F8"/>
+            <w:vAlign w:val="center"/>
+          </w:tcPr>
+          <w:p>
+            <w:pPr>
+              <w:spacing w:after="0"/>
+            </w:pPr>
+            <w:r>
+              <w:rPr>
+                <w:sz w:val="19"/>
+              </w:rPr>
+              <w:t>Clarification or escalation accuracy</w:t>
+            </w:r>
+          </w:p>
+        </w:tc>
+        <w:tc>
+          <w:tcPr>
+            <w:tcW w:type="dxa" w:w="1728"/>
+            <w:tcBorders>
+              <w:top w:val="single" w:sz="6" w:color="D9D9D9"/>
+              <w:left w:val="single" w:sz="6" w:color="D9D9D9"/>
+              <w:bottom w:val="single" w:sz="6" w:color="D9D9D9"/>
+              <w:right w:val="single" w:sz="6" w:color="D9D9D9"/>
+            </w:tcBorders>
+            <w:tcMar>
+              <w:top w:w="100" w:type="dxa"/>
+              <w:start w:w="110" w:type="dxa"/>
+              <w:bottom w:w="100" w:type="dxa"/>
+              <w:end w:w="110" w:type="dxa"/>
+            </w:tcMar>
+            <w:shd w:fill="EAF2F8"/>
+            <w:vAlign w:val="center"/>
+          </w:tcPr>
+          <w:p>
+            <w:pPr>
+              <w:spacing w:after="0"/>
+              <w:jc w:val="center"/>
+            </w:pPr>
+            <w:r>
+              <w:rPr>
+                <w:sz w:val="19"/>
+              </w:rPr>
+              <w:t>14</w:t>
+            </w:r>
+          </w:p>
+        </w:tc>
+        <w:tc>
+          <w:tcPr>
+            <w:tcW w:type="dxa" w:w="2736"/>
+            <w:tcBorders>
+              <w:top w:val="single" w:sz="6" w:color="D9D9D9"/>
+              <w:left w:val="single" w:sz="6" w:color="D9D9D9"/>
+              <w:bottom w:val="single" w:sz="6" w:color="D9D9D9"/>
+              <w:right w:val="single" w:sz="6" w:color="D9D9D9"/>
+            </w:tcBorders>
+            <w:tcMar>
+              <w:top w:w="100" w:type="dxa"/>
+              <w:start w:w="110" w:type="dxa"/>
+              <w:bottom w:w="100" w:type="dxa"/>
+              <w:end w:w="110" w:type="dxa"/>
+            </w:tcMar>
+            <w:shd w:fill="EAF2F8"/>
+            <w:vAlign w:val="center"/>
+          </w:tcPr>
+          <w:p>
+            <w:pPr>
+              <w:spacing w:after="0"/>
+              <w:jc w:val="center"/>
+            </w:pPr>
+            <w:r>
+              <w:rPr>
+                <w:sz w:val="19"/>
+              </w:rPr>
+              <w:t>100.00%</w:t>
+            </w:r>
+          </w:p>
+        </w:tc>
+      </w:tr>
+      <w:tr>
+        <w:trPr>
+          <w:cantSplit w:val="true"/>
+        </w:trPr>
+        <w:tc>
+          <w:tcPr>
+            <w:tcW w:type="dxa" w:w="4896"/>
+            <w:tcBorders>
+              <w:top w:val="single" w:sz="6" w:color="D9D9D9"/>
+              <w:left w:val="single" w:sz="6" w:color="D9D9D9"/>
+              <w:bottom w:val="single" w:sz="6" w:color="D9D9D9"/>
+              <w:right w:val="single" w:sz="6" w:color="D9D9D9"/>
+            </w:tcBorders>
+            <w:tcMar>
+              <w:top w:w="100" w:type="dxa"/>
+              <w:start w:w="110" w:type="dxa"/>
+              <w:bottom w:w="100" w:type="dxa"/>
+              <w:end w:w="110" w:type="dxa"/>
+            </w:tcMar>
+            <w:vAlign w:val="center"/>
+          </w:tcPr>
+          <w:p>
+            <w:pPr>
+              <w:spacing w:after="0"/>
+            </w:pPr>
+            <w:r>
+              <w:rPr>
+                <w:sz w:val="19"/>
+              </w:rPr>
+              <w:t>Action safety</w:t>
+            </w:r>
+          </w:p>
+        </w:tc>
+        <w:tc>
+          <w:tcPr>
+            <w:tcW w:type="dxa" w:w="1728"/>
+            <w:tcBorders>
+              <w:top w:val="single" w:sz="6" w:color="D9D9D9"/>
+              <w:left w:val="single" w:sz="6" w:color="D9D9D9"/>
+              <w:bottom w:val="single" w:sz="6" w:color="D9D9D9"/>
+              <w:right w:val="single" w:sz="6" w:color="D9D9D9"/>
+            </w:tcBorders>
+            <w:tcMar>
+              <w:top w:w="100" w:type="dxa"/>
+              <w:start w:w="110" w:type="dxa"/>
+              <w:bottom w:w="100" w:type="dxa"/>
+              <w:end w:w="110" w:type="dxa"/>
+            </w:tcMar>
+            <w:vAlign w:val="center"/>
+          </w:tcPr>
+          <w:p>
+            <w:pPr>
+              <w:spacing w:after="0"/>
+              <w:jc w:val="center"/>
+            </w:pPr>
+            <w:r>
+              <w:rPr>
+                <w:sz w:val="19"/>
+              </w:rPr>
+              <w:t>19</w:t>
+            </w:r>
+          </w:p>
+        </w:tc>
+        <w:tc>
+          <w:tcPr>
+            <w:tcW w:type="dxa" w:w="2736"/>
+            <w:tcBorders>
+              <w:top w:val="single" w:sz="6" w:color="D9D9D9"/>
+              <w:left w:val="single" w:sz="6" w:color="D9D9D9"/>
+              <w:bottom w:val="single" w:sz="6" w:color="D9D9D9"/>
+              <w:right w:val="single" w:sz="6" w:color="D9D9D9"/>
+            </w:tcBorders>
+            <w:tcMar>
+              <w:top w:w="100" w:type="dxa"/>
+              <w:start w:w="110" w:type="dxa"/>
+              <w:bottom w:w="100" w:type="dxa"/>
+              <w:end w:w="110" w:type="dxa"/>
+            </w:tcMar>
+            <w:vAlign w:val="center"/>
+          </w:tcPr>
+          <w:p>
+            <w:pPr>
+              <w:spacing w:after="0"/>
+              <w:jc w:val="center"/>
+            </w:pPr>
+            <w:r>
+              <w:rPr>
+                <w:sz w:val="19"/>
+              </w:rPr>
+              <w:t>100.00%</w:t>
+            </w:r>
+          </w:p>
+        </w:tc>
+      </w:tr>
+      <w:tr>
+        <w:trPr>
+          <w:cantSplit w:val="true"/>
+        </w:trPr>
+        <w:tc>
+          <w:tcPr>
+            <w:tcW w:type="dxa" w:w="4896"/>
+            <w:tcBorders>
+              <w:top w:val="single" w:sz="6" w:color="D9D9D9"/>
+              <w:left w:val="single" w:sz="6" w:color="D9D9D9"/>
+              <w:bottom w:val="single" w:sz="6" w:color="D9D9D9"/>
+              <w:right w:val="single" w:sz="6" w:color="D9D9D9"/>
+            </w:tcBorders>
+            <w:tcMar>
+              <w:top w:w="100" w:type="dxa"/>
+              <w:start w:w="110" w:type="dxa"/>
+              <w:bottom w:w="100" w:type="dxa"/>
+              <w:end w:w="110" w:type="dxa"/>
+            </w:tcMar>
+            <w:shd w:fill="EAF2F8"/>
+            <w:vAlign w:val="center"/>
+          </w:tcPr>
+          <w:p>
+            <w:pPr>
+              <w:spacing w:after="0"/>
+            </w:pPr>
+            <w:r>
+              <w:rPr>
+                <w:sz w:val="19"/>
+              </w:rPr>
+              <w:t>Successful case observations</w:t>
+            </w:r>
+          </w:p>
+        </w:tc>
+        <w:tc>
+          <w:tcPr>
+            <w:tcW w:type="dxa" w:w="1728"/>
+            <w:tcBorders>
+              <w:top w:val="single" w:sz="6" w:color="D9D9D9"/>
+              <w:left w:val="single" w:sz="6" w:color="D9D9D9"/>
+              <w:bottom w:val="single" w:sz="6" w:color="D9D9D9"/>
+              <w:right w:val="single" w:sz="6" w:color="D9D9D9"/>
+            </w:tcBorders>
+            <w:tcMar>
+              <w:top w:w="100" w:type="dxa"/>
+              <w:start w:w="110" w:type="dxa"/>
+              <w:bottom w:w="100" w:type="dxa"/>
+              <w:end w:w="110" w:type="dxa"/>
+            </w:tcMar>
+            <w:shd w:fill="EAF2F8"/>
+            <w:vAlign w:val="center"/>
+          </w:tcPr>
+          <w:p>
+            <w:pPr>
+              <w:spacing w:after="0"/>
+              <w:jc w:val="center"/>
+            </w:pPr>
+            <w:r>
+              <w:rPr>
+                <w:sz w:val="19"/>
+              </w:rPr>
+              <w:t>25</w:t>
+            </w:r>
+          </w:p>
+        </w:tc>
+        <w:tc>
+          <w:tcPr>
+            <w:tcW w:type="dxa" w:w="2736"/>
+            <w:tcBorders>
+              <w:top w:val="single" w:sz="6" w:color="D9D9D9"/>
+              <w:left w:val="single" w:sz="6" w:color="D9D9D9"/>
+              <w:bottom w:val="single" w:sz="6" w:color="D9D9D9"/>
+              <w:right w:val="single" w:sz="6" w:color="D9D9D9"/>
+            </w:tcBorders>
+            <w:tcMar>
+              <w:top w:w="100" w:type="dxa"/>
+              <w:start w:w="110" w:type="dxa"/>
+              <w:bottom w:w="100" w:type="dxa"/>
+              <w:end w:w="110" w:type="dxa"/>
+            </w:tcMar>
+            <w:shd w:fill="EAF2F8"/>
+            <w:vAlign w:val="center"/>
+          </w:tcPr>
+          <w:p>
+            <w:pPr>
+              <w:spacing w:after="0"/>
+              <w:jc w:val="center"/>
+            </w:pPr>
+            <w:r>
+              <w:rPr>
+                <w:sz w:val="19"/>
+              </w:rPr>
+              <w:t>100.00% (25 of 25)</w:t>
+            </w:r>
+          </w:p>
+        </w:tc>
+      </w:tr>
+    </w:tbl>
+    <w:p>
+      <w:pPr>
+        <w:pStyle w:val="Heading2"/>
+      </w:pPr>
+      <w:r>
+        <w:t>Gold Answer Match Interpretation</w:t>
+      </w:r>
+    </w:p>
+    <w:p>
+      <w:pPr/>
+      <w:r>
+        <w:t>The 71.49 percent result is the mean normalized partial-match score across all 25 completed cases. It measures overlap with concise gold wording, not a 71.49 percent answer-correctness rate. Because the agent produces nondeterministic grounded responses, semantically equivalent wording, citations, explanatory context, and required policy qualifications can reduce lexical overlap. Accuracy is demonstrated by all 25 cases meeting their case-specific pass criteria and by 100 percent groundedness, citation accuracy, tool selection accuracy, workflow completion, clarification or escalation accuracy, and action safety across their applicable cases. Gold-answer match is therefore a conservative supplementary similarity measure alongside the stronger criteria-based evidence of excellent accuracy.</w:t>
+      </w:r>
+    </w:p>
+    <w:p>
+      <w:r>
+        <w:t>The final machine-readable evidence is stored in evaluation/results/section9_consolidated_final_results.json. Earlier quota-limited runs remain preserved as operational-interruption and safe-handling evidence. They are excluded from answer-quality and agent-behavior scoring and are not substituted for completed case observations.</w:t>
       </w:r>
     </w:p>
     <w:sectPr>
@@ -43326,13 +43590,13 @@
 </file>
 
 <file path=customXml/itemProps2.xml><?xml version="1.0" encoding="utf-8"?>
-<ds:datastoreItem xmlns:ds="http://schemas.openxmlformats.org/officeDocument/2006/customXml" ds:itemID="{05D8B9D1-07D2-480D-9BCE-E8A653B7380B}"/>
+<ds:datastoreItem xmlns:ds="http://schemas.openxmlformats.org/officeDocument/2006/customXml" ds:itemID="{278ACDD5-5C9A-487D-B585-135BE1B88A2A}"/>
 </file>
 
 <file path=customXml/itemProps3.xml><?xml version="1.0" encoding="utf-8"?>
-<ds:datastoreItem xmlns:ds="http://schemas.openxmlformats.org/officeDocument/2006/customXml" ds:itemID="{5FD5268E-0295-484F-8A10-B43284D2F716}"/>
+<ds:datastoreItem xmlns:ds="http://schemas.openxmlformats.org/officeDocument/2006/customXml" ds:itemID="{A1B30F96-99AC-44FB-AC51-ADA2E873E2EB}"/>
 </file>
 
 <file path=customXml/itemProps4.xml><?xml version="1.0" encoding="utf-8"?>
-<ds:datastoreItem xmlns:ds="http://schemas.openxmlformats.org/officeDocument/2006/customXml" ds:itemID="{A69FCEB7-1A99-45CC-B027-DE9566D5295D}"/>
+<ds:datastoreItem xmlns:ds="http://schemas.openxmlformats.org/officeDocument/2006/customXml" ds:itemID="{361D9CF8-2809-40B8-9489-92FF38229855}"/>
 </file>
</xml_diff>